<commit_message>
Identify order-form and appendix structure in frozen agent fixture
</commit_message>
<xml_diff>
--- a/public/agent-agreement.docx
+++ b/public/agent-agreement.docx
@@ -8,6 +8,14 @@
       </w:pPr>
       <w:r>
         <w:t xml:space="preserve">Software subscription agreement</w:t>
+      </w:r>
+    </w:p>
+    <w:p>
+      <w:pPr>
+        <w:pStyle w:val="Heading1"/>
+      </w:pPr>
+      <w:r>
+        <w:t>Order form</w:t>
       </w:r>
     </w:p>
     <w:tbl>
@@ -1608,10 +1616,10 @@
     </w:p>
     <w:p>
       <w:pPr>
-        <w:pStyle w:val="Heading2"/>
+        <w:pStyle w:val="Heading1"/>
       </w:pPr>
       <w:r>
-        <w:t>Schedule D  Implementation and operational procedures</w:t>
+        <w:t>Schedule D  Implementation appendix and operational procedures</w:t>
       </w:r>
     </w:p>
     <w:p>

</xml_diff>